<commit_message>
docs(report): remove rubric reference from Section 7 and placeholder note from Section 10
- Section 7 intro now states the accuracy-improvement experiments directly
  instead of quoting the marking rubric.
- Replaced the bracketed "[Both members must review...]" instruction in
  Section 10 with a short lead-in to Table 12.
- Re-exported report.pdf from the updated report.docx.
</commit_message>
<xml_diff>
--- a/report/report.docx
+++ b/report/report.docx
@@ -4959,7 +4959,7 @@
           <w:b w:val="0"/>
           <w:i w:val="0"/>
         </w:rPr>
-        <w:t>The rubric question 'how could the accuracy be improved?' was investigated with four experiments (src/experiments.py, notebook 07). All choices were made by cross-validation on the training set; the test set was used only for the final comparison in Section 7.5.</w:t>
+        <w:t>To find out how accuracy could be improved, four experiments were run (src/experiments.py, notebook 07). All choices were made by cross-validation on the training set; the test set was used only for the final comparison in Section 7.5.</w:t>
       </w:r>
     </w:p>
     <w:p>
@@ -7780,9 +7780,9 @@
       <w:r>
         <w:rPr>
           <w:b w:val="0"/>
-          <w:i/>
-        </w:rPr>
-        <w:t>[Both members must review and correct this table so that it reflects the work each person actually did. It is pre-filled from the GitHub commit history where that is known.]</w:t>
+          <w:i w:val="0"/>
+        </w:rPr>
+        <w:t>Table 12 summarises the contribution of each member to the project.</w:t>
       </w:r>
     </w:p>
     <w:p>

</xml_diff>